<commit_message>
docs: add Python programming report document v02
</commit_message>
<xml_diff>
--- a/docs/Bao_Cao_Lap_Trinh_Python_v02.docx
+++ b/docs/Bao_Cao_Lap_Trinh_Python_v02.docx
@@ -1038,7 +1038,11 @@
     <w:sdt>
       <w:sdtPr>
         <w:rPr>
-          <w:rFonts w:ascii="Times New Roman" w:hAnsi="Times New Roman" w:cs="Times New Roman"/>
+          <w:rFonts w:ascii="Times New Roman" w:eastAsia="Arial" w:hAnsi="Times New Roman" w:cs="Times New Roman"/>
+          <w:color w:val="auto"/>
+          <w:sz w:val="22"/>
+          <w:szCs w:val="22"/>
+          <w:lang w:val="vi"/>
         </w:rPr>
         <w:id w:val="-1254969825"/>
         <w:docPartObj>
@@ -1048,14 +1052,9 @@
       </w:sdtPr>
       <w:sdtEndPr>
         <w:rPr>
-          <w:rFonts w:eastAsia="Arial"/>
           <w:b/>
           <w:bCs/>
           <w:noProof/>
-          <w:color w:val="auto"/>
-          <w:sz w:val="22"/>
-          <w:szCs w:val="22"/>
-          <w:lang w:val="vi"/>
         </w:rPr>
       </w:sdtEndPr>
       <w:sdtContent>
@@ -5995,11 +5994,15 @@
         </w:numPr>
         <w:rPr>
           <w:rFonts w:ascii="Times New Roman" w:hAnsi="Times New Roman" w:cs="Times New Roman"/>
-        </w:rPr>
-      </w:pPr>
-      <w:r>
-        <w:rPr>
-          <w:rFonts w:ascii="Times New Roman" w:hAnsi="Times New Roman" w:cs="Times New Roman"/>
+          <w:sz w:val="26"/>
+          <w:szCs w:val="26"/>
+        </w:rPr>
+      </w:pPr>
+      <w:r>
+        <w:rPr>
+          <w:rFonts w:ascii="Times New Roman" w:hAnsi="Times New Roman" w:cs="Times New Roman"/>
+          <w:sz w:val="26"/>
+          <w:szCs w:val="26"/>
         </w:rPr>
         <w:t>Kiểm thử tự động bằng Pytest.</w:t>
       </w:r>
@@ -6113,8 +6116,8 @@
         <w:jc w:val="both"/>
         <w:rPr>
           <w:rFonts w:ascii="Times New Roman" w:eastAsia="Times New Roman" w:hAnsi="Times New Roman" w:cs="Times New Roman"/>
-          <w:sz w:val="26"/>
-          <w:szCs w:val="26"/>
+          <w:sz w:val="28"/>
+          <w:szCs w:val="28"/>
         </w:rPr>
       </w:pPr>
       <w:bookmarkStart w:id="10" w:name="_Toc240557099"/>
@@ -6123,8 +6126,8 @@
           <w:rFonts w:ascii="Times New Roman" w:eastAsia="Times New Roman" w:hAnsi="Times New Roman" w:cs="Times New Roman"/>
           <w:b/>
           <w:bCs/>
-          <w:sz w:val="26"/>
-          <w:szCs w:val="26"/>
+          <w:sz w:val="28"/>
+          <w:szCs w:val="28"/>
         </w:rPr>
         <w:t>CHƯƠNG 2. PHÂN TÍCH VÀ THIẾT KẾ HỆ THỐNG</w:t>
       </w:r>
@@ -7370,8 +7373,9 @@
           <w:szCs w:val="20"/>
           <w:lang w:val="en-US"/>
         </w:rPr>
-        <w:t xml:space="preserve"> </w:t>
-      </w:r>
+        <w:t xml:space="preserve"> 3: </w:t>
+      </w:r>
+      <w:proofErr w:type="spellStart"/>
       <w:r>
         <w:rPr>
           <w:rFonts w:ascii="Times New Roman" w:eastAsia="Times New Roman" w:hAnsi="Times New Roman" w:cs="Times New Roman"/>
@@ -7381,8 +7385,9 @@
           <w:szCs w:val="20"/>
           <w:lang w:val="en-US"/>
         </w:rPr>
-        <w:t>3</w:t>
-      </w:r>
+        <w:t>Sơ</w:t>
+      </w:r>
+      <w:proofErr w:type="spellEnd"/>
       <w:r>
         <w:rPr>
           <w:rFonts w:ascii="Times New Roman" w:eastAsia="Times New Roman" w:hAnsi="Times New Roman" w:cs="Times New Roman"/>
@@ -7392,7 +7397,7 @@
           <w:szCs w:val="20"/>
           <w:lang w:val="en-US"/>
         </w:rPr>
-        <w:t xml:space="preserve">: </w:t>
+        <w:t xml:space="preserve"> </w:t>
       </w:r>
       <w:proofErr w:type="spellStart"/>
       <w:r>
@@ -7404,7 +7409,7 @@
           <w:szCs w:val="20"/>
           <w:lang w:val="en-US"/>
         </w:rPr>
-        <w:t>Sơ</w:t>
+        <w:t>đồ</w:t>
       </w:r>
       <w:proofErr w:type="spellEnd"/>
       <w:r>
@@ -7428,7 +7433,7 @@
           <w:szCs w:val="20"/>
           <w:lang w:val="en-US"/>
         </w:rPr>
-        <w:t>đồ</w:t>
+        <w:t>thực</w:t>
       </w:r>
       <w:proofErr w:type="spellEnd"/>
       <w:r>
@@ -7452,7 +7457,7 @@
           <w:szCs w:val="20"/>
           <w:lang w:val="en-US"/>
         </w:rPr>
-        <w:t>thực</w:t>
+        <w:t>thể</w:t>
       </w:r>
       <w:proofErr w:type="spellEnd"/>
       <w:r>
@@ -7464,7 +7469,7 @@
           <w:szCs w:val="20"/>
           <w:lang w:val="en-US"/>
         </w:rPr>
-        <w:t xml:space="preserve"> </w:t>
+        <w:t xml:space="preserve"> ERD </w:t>
       </w:r>
       <w:proofErr w:type="spellStart"/>
       <w:r>
@@ -7476,7 +7481,7 @@
           <w:szCs w:val="20"/>
           <w:lang w:val="en-US"/>
         </w:rPr>
-        <w:t>thể</w:t>
+        <w:t>hê</w:t>
       </w:r>
       <w:proofErr w:type="spellEnd"/>
       <w:r>
@@ -7488,7 +7493,7 @@
           <w:szCs w:val="20"/>
           <w:lang w:val="en-US"/>
         </w:rPr>
-        <w:t xml:space="preserve"> ERD </w:t>
+        <w:t xml:space="preserve"> </w:t>
       </w:r>
       <w:proofErr w:type="spellStart"/>
       <w:r>
@@ -7500,7 +7505,7 @@
           <w:szCs w:val="20"/>
           <w:lang w:val="en-US"/>
         </w:rPr>
-        <w:t>hê</w:t>
+        <w:t>thống</w:t>
       </w:r>
       <w:proofErr w:type="spellEnd"/>
       <w:r>
@@ -7512,53 +7517,7 @@
           <w:szCs w:val="20"/>
           <w:lang w:val="en-US"/>
         </w:rPr>
-        <w:t xml:space="preserve"> </w:t>
-      </w:r>
-      <w:proofErr w:type="spellStart"/>
-      <w:r>
-        <w:rPr>
-          <w:rFonts w:ascii="Times New Roman" w:eastAsia="Times New Roman" w:hAnsi="Times New Roman" w:cs="Times New Roman"/>
-          <w:i/>
-          <w:iCs/>
-          <w:sz w:val="20"/>
-          <w:szCs w:val="20"/>
-          <w:lang w:val="en-US"/>
-        </w:rPr>
-        <w:t>thống</w:t>
-      </w:r>
-      <w:proofErr w:type="spellEnd"/>
-      <w:r>
-        <w:rPr>
-          <w:rFonts w:ascii="Times New Roman" w:eastAsia="Times New Roman" w:hAnsi="Times New Roman" w:cs="Times New Roman"/>
-          <w:i/>
-          <w:iCs/>
-          <w:sz w:val="20"/>
-          <w:szCs w:val="20"/>
-          <w:lang w:val="en-US"/>
-        </w:rPr>
-        <w:t xml:space="preserve"> POS Management (part</w:t>
-      </w:r>
-      <w:r>
-        <w:rPr>
-          <w:rFonts w:ascii="Times New Roman" w:eastAsia="Times New Roman" w:hAnsi="Times New Roman" w:cs="Times New Roman"/>
-          <w:i/>
-          <w:iCs/>
-          <w:sz w:val="20"/>
-          <w:szCs w:val="20"/>
-          <w:lang w:val="en-US"/>
-        </w:rPr>
-        <w:t xml:space="preserve"> 2</w:t>
-      </w:r>
-      <w:r>
-        <w:rPr>
-          <w:rFonts w:ascii="Times New Roman" w:eastAsia="Times New Roman" w:hAnsi="Times New Roman" w:cs="Times New Roman"/>
-          <w:i/>
-          <w:iCs/>
-          <w:sz w:val="20"/>
-          <w:szCs w:val="20"/>
-          <w:lang w:val="en-US"/>
-        </w:rPr>
-        <w:t>)</w:t>
+        <w:t xml:space="preserve"> POS Management (part 2)</w:t>
       </w:r>
     </w:p>
     <w:p>
@@ -7944,7 +7903,30 @@
           <w:sz w:val="20"/>
           <w:szCs w:val="20"/>
         </w:rPr>
-        <w:t>Hình 2.6.2 — Sơ đồ tuần tự: Phân tích báo cáo bằng AI (Gemini/Groq)</w:t>
+        <w:t>Hình 2.</w:t>
+      </w:r>
+      <w:r>
+        <w:rPr>
+          <w:rFonts w:ascii="Times New Roman" w:eastAsia="Times New Roman" w:hAnsi="Times New Roman" w:cs="Times New Roman"/>
+          <w:i/>
+          <w:iCs/>
+          <w:color w:val="303030"/>
+          <w:sz w:val="20"/>
+          <w:szCs w:val="20"/>
+          <w:lang w:val="en-US"/>
+        </w:rPr>
+        <w:t xml:space="preserve">4 </w:t>
+      </w:r>
+      <w:r>
+        <w:rPr>
+          <w:rFonts w:ascii="Times New Roman" w:eastAsia="Times New Roman" w:hAnsi="Times New Roman" w:cs="Times New Roman"/>
+          <w:i/>
+          <w:iCs/>
+          <w:color w:val="303030"/>
+          <w:sz w:val="20"/>
+          <w:szCs w:val="20"/>
+        </w:rPr>
+        <w:t xml:space="preserve"> — Sơ đồ tuần tự: Phân tích báo cáo bằng AI (Gemini/Groq)</w:t>
       </w:r>
     </w:p>
     <w:p>
@@ -10665,7 +10647,55 @@
                 <w:sz w:val="26"/>
                 <w:szCs w:val="26"/>
               </w:rPr>
-              <w:t>Tìm kiếm, tra cứu, không sửa được.</w:t>
+              <w:t>Tìm kiếm, tra cứu</w:t>
+            </w:r>
+            <w:r>
+              <w:rPr>
+                <w:rFonts w:ascii="Times New Roman" w:eastAsia="Times New Roman" w:hAnsi="Times New Roman" w:cs="Times New Roman"/>
+                <w:sz w:val="26"/>
+                <w:szCs w:val="26"/>
+                <w:lang w:val="en-US"/>
+              </w:rPr>
+              <w:t xml:space="preserve"> </w:t>
+            </w:r>
+            <w:proofErr w:type="spellStart"/>
+            <w:r>
+              <w:rPr>
+                <w:rFonts w:ascii="Times New Roman" w:eastAsia="Times New Roman" w:hAnsi="Times New Roman" w:cs="Times New Roman"/>
+                <w:sz w:val="26"/>
+                <w:szCs w:val="26"/>
+                <w:lang w:val="en-US"/>
+              </w:rPr>
+              <w:t>khách</w:t>
+            </w:r>
+            <w:proofErr w:type="spellEnd"/>
+            <w:r>
+              <w:rPr>
+                <w:rFonts w:ascii="Times New Roman" w:eastAsia="Times New Roman" w:hAnsi="Times New Roman" w:cs="Times New Roman"/>
+                <w:sz w:val="26"/>
+                <w:szCs w:val="26"/>
+                <w:lang w:val="en-US"/>
+              </w:rPr>
+              <w:t xml:space="preserve"> </w:t>
+            </w:r>
+            <w:proofErr w:type="spellStart"/>
+            <w:r>
+              <w:rPr>
+                <w:rFonts w:ascii="Times New Roman" w:eastAsia="Times New Roman" w:hAnsi="Times New Roman" w:cs="Times New Roman"/>
+                <w:sz w:val="26"/>
+                <w:szCs w:val="26"/>
+                <w:lang w:val="en-US"/>
+              </w:rPr>
+              <w:t>hàng</w:t>
+            </w:r>
+            <w:proofErr w:type="spellEnd"/>
+            <w:r>
+              <w:rPr>
+                <w:rFonts w:ascii="Times New Roman" w:eastAsia="Times New Roman" w:hAnsi="Times New Roman" w:cs="Times New Roman"/>
+                <w:sz w:val="26"/>
+                <w:szCs w:val="26"/>
+              </w:rPr>
+              <w:t>.</w:t>
             </w:r>
           </w:p>
         </w:tc>
@@ -11158,29 +11188,7 @@
           <w:szCs w:val="26"/>
           <w:lang w:val="en-US"/>
         </w:rPr>
-        <w:t xml:space="preserve"> </w:t>
-      </w:r>
-      <w:r>
-        <w:rPr>
-          <w:rFonts w:ascii="Times New Roman" w:hAnsi="Times New Roman" w:cs="Times New Roman"/>
-          <w:b/>
-          <w:bCs/>
-          <w:sz w:val="26"/>
-          <w:szCs w:val="26"/>
-          <w:lang w:val="en-US"/>
-        </w:rPr>
-        <w:t>4</w:t>
-      </w:r>
-      <w:r>
-        <w:rPr>
-          <w:rFonts w:ascii="Times New Roman" w:hAnsi="Times New Roman" w:cs="Times New Roman"/>
-          <w:b/>
-          <w:bCs/>
-          <w:sz w:val="26"/>
-          <w:szCs w:val="26"/>
-          <w:lang w:val="en-US"/>
-        </w:rPr>
-        <w:t xml:space="preserve">: </w:t>
+        <w:t xml:space="preserve"> 4: </w:t>
       </w:r>
       <w:proofErr w:type="spellStart"/>
       <w:r>
@@ -17368,8 +17376,8 @@
           <w:rFonts w:ascii="Times New Roman" w:eastAsia="Times New Roman" w:hAnsi="Times New Roman" w:cs="Times New Roman"/>
           <w:b/>
           <w:bCs/>
-          <w:sz w:val="26"/>
-          <w:szCs w:val="26"/>
+          <w:sz w:val="28"/>
+          <w:szCs w:val="28"/>
         </w:rPr>
       </w:pPr>
       <w:bookmarkStart w:id="70" w:name="_Toc240557135"/>
@@ -17378,8 +17386,8 @@
           <w:rFonts w:ascii="Times New Roman" w:eastAsia="Times New Roman" w:hAnsi="Times New Roman" w:cs="Times New Roman"/>
           <w:b/>
           <w:bCs/>
-          <w:sz w:val="26"/>
-          <w:szCs w:val="26"/>
+          <w:sz w:val="28"/>
+          <w:szCs w:val="28"/>
         </w:rPr>
         <w:t>CHƯƠNG 5. KẾT LUẬN VÀ HƯỚNG PHÁT TRIỂN</w:t>
       </w:r>
@@ -27223,6 +27231,7 @@
   <w:style w:type="character" w:default="1" w:styleId="DefaultParagraphFont">
     <w:name w:val="Default Paragraph Font"/>
     <w:uiPriority w:val="1"/>
+    <w:semiHidden/>
     <w:unhideWhenUsed/>
   </w:style>
   <w:style w:type="table" w:default="1" w:styleId="TableNormal">

</xml_diff>